<commit_message>
Al dia con el proyecto (2026-09-29)
- Roturas de pinza: tres causas encontradas y arregladas (la cinta se para
  mientras la bandeja tiene un cubo encajado y mientras el Loader suelta; el
  Sorter espera al encaje) y cierre de pinza 0.024: el cubo ya no flota entre
  los dedos. 550 piezas seguidas sin roturas en las pruebas.
- Cada subproducto es una pieza distinta: lotes, reparto y stock por variante
  (Tornillo 10 mm nunca completa un pedido de 20 mm). Almacen por variante.
- Panel de control: misma cinematica que los robots (antes la pinza salia
  14-24 cm desviada), "Centrar sobre cubo" con la posicion real, Automatico
  reparte los pedidos entre cadenas y se cierra con un cierre normal.
- arrancar_todo.sh arranca aunque la Pico del Loader no este enchufada.
- Fuera las demos antiguas de un robot. Nueva herramienta: grabadora_pinza.py.
- Documentacion al dia y sin IPs de la red (marcadores IP_DEL_PRINCIPAL...).

Co-Authored-By: Claude Opus 5.5 <noreply@anthropic.com>
</commit_message>
<xml_diff>
--- a/Documentacion/Plantillas/Configuracion_Taller_EJEMPLO.docx
+++ b/Documentacion/Plantillas/Configuracion_Taller_EJEMPLO.docx
@@ -136,7 +136,7 @@
               <w:rPr>
                 <w:sz w:val="19"/>
               </w:rPr>
-              <w:t>Persona responsable del taller</w:t>
+              <w:t>Jesús (responsable del taller)</w:t>
             </w:r>
           </w:p>
         </w:tc>
@@ -915,7 +915,7 @@
               <w:rPr>
                 <w:sz w:val="19"/>
               </w:rPr>
-              <w:t>192.168.1.10</w:t>
+              <w:t>IP_DEL_PRINCIPAL</w:t>
             </w:r>
           </w:p>
         </w:tc>
@@ -996,7 +996,7 @@
               <w:rPr>
                 <w:sz w:val="19"/>
               </w:rPr>
-              <w:t>192.168.1.11</w:t>
+              <w:t>IP_DEL_CLON</w:t>
             </w:r>
           </w:p>
         </w:tc>
@@ -2038,7 +2038,7 @@
         <w:rPr>
           <w:b w:val="0"/>
         </w:rPr>
-        <w:t>: si la cadena funciona en otro ordenador que la web, escribe la dirección de la web del principal (http://192.168.1.10:8000) y pulsa su Guardar. Si está en el mismo ordenador que la web, déjalo vacío.</w:t>
+        <w:t>: si la cadena funciona en otro ordenador que la web, escribe la dirección de la web del principal (http://IP_DEL_PRINCIPAL:8000) y pulsa su Guardar. Si está en el mismo ordenador que la web, déjalo vacío.</w:t>
       </w:r>
     </w:p>
     <w:p>
@@ -2475,7 +2475,7 @@
               <w:rPr>
                 <w:sz w:val="19"/>
               </w:rPr>
-              <w:t>http://192.168.1.10:8000</w:t>
+              <w:t>http://IP_DEL_PRINCIPAL:8000</w:t>
             </w:r>
           </w:p>
         </w:tc>
@@ -2490,7 +2490,7 @@
                 <w:rFonts w:ascii="Consolas" w:hAnsi="Consolas"/>
                 <w:sz w:val="17"/>
               </w:rPr>
-              <w:t>./crear_linea.sh 3 3 http://192.168.1.10:8000 60</w:t>
+              <w:t>./crear_linea.sh 3 3 http://IP_DEL_PRINCIPAL:8000 60</w:t>
             </w:r>
           </w:p>
         </w:tc>
@@ -2554,7 +2554,7 @@
               <w:rPr>
                 <w:sz w:val="19"/>
               </w:rPr>
-              <w:t>http://192.168.1.10:8000</w:t>
+              <w:t>http://IP_DEL_PRINCIPAL:8000</w:t>
             </w:r>
           </w:p>
         </w:tc>
@@ -2569,7 +2569,7 @@
                 <w:rFonts w:ascii="Consolas" w:hAnsi="Consolas"/>
                 <w:sz w:val="17"/>
               </w:rPr>
-              <w:t>./crear_linea.sh 4 4 http://192.168.1.10:8000 60</w:t>
+              <w:t>./crear_linea.sh 4 4 http://IP_DEL_PRINCIPAL:8000 60</w:t>
             </w:r>
           </w:p>
         </w:tc>
@@ -4822,7 +4822,7 @@
               <w:rPr>
                 <w:sz w:val="19"/>
               </w:rPr>
-              <w:t>Nombre Apellido</w:t>
+              <w:t>Jesús</w:t>
             </w:r>
           </w:p>
         </w:tc>
@@ -5622,6 +5622,30 @@
                 <w:rFonts w:ascii="Consolas" w:hAnsi="Consolas"/>
                 <w:sz w:val="18"/>
               </w:rPr>
+              <w:t>git clone http://IP_DE_LA_QNAP:3000/Virtual-Robotic/robotica.git robotica</w:t>
+            </w:r>
+          </w:p>
+          <w:p>
+            <w:pPr>
+              <w:spacing w:after="0"/>
+            </w:pPr>
+            <w:r>
+              <w:rPr>
+                <w:rFonts w:ascii="Consolas" w:hAnsi="Consolas"/>
+                <w:sz w:val="18"/>
+              </w:rPr>
+              <w:t>#   o, si la QNAP está apagada:</w:t>
+            </w:r>
+          </w:p>
+          <w:p>
+            <w:pPr>
+              <w:spacing w:after="0"/>
+            </w:pPr>
+            <w:r>
+              <w:rPr>
+                <w:rFonts w:ascii="Consolas" w:hAnsi="Consolas"/>
+                <w:sz w:val="18"/>
+              </w:rPr>
               <w:t>git clone https://github.com/virtual-robotic/virtual-robotic.git robotica</w:t>
             </w:r>
           </w:p>
@@ -5714,7 +5738,7 @@
           <w:b w:val="0"/>
           <w:i w:val="0"/>
         </w:rPr>
-        <w:t>Comprueba desde otro equipo que la web se abre: http://192.168.1.10:8000</w:t>
+        <w:t>Comprueba desde otro equipo que la web se abre: http://IP_DEL_PRINCIPAL:8000</w:t>
       </w:r>
     </w:p>
     <w:p>
@@ -5778,7 +5802,7 @@
                 <w:rFonts w:ascii="Consolas" w:hAnsi="Consolas"/>
                 <w:sz w:val="18"/>
               </w:rPr>
-              <w:t>./crear_linea.sh 3 3 http://192.168.1.10:8000 60     # en el clon: cadena 3</w:t>
+              <w:t>./crear_linea.sh 3 3 http://IP_DEL_PRINCIPAL:8000 60     # en el clon: cadena 3</w:t>
             </w:r>
           </w:p>
           <w:p>
@@ -5790,7 +5814,7 @@
                 <w:rFonts w:ascii="Consolas" w:hAnsi="Consolas"/>
                 <w:sz w:val="18"/>
               </w:rPr>
-              <w:t>./crear_linea.sh 4 4 http://192.168.1.10:8000 60     # en el clon: cadena 4</w:t>
+              <w:t>./crear_linea.sh 4 4 http://IP_DEL_PRINCIPAL:8000 60     # en el clon: cadena 4</w:t>
             </w:r>
           </w:p>
         </w:tc>
@@ -5862,7 +5886,7 @@
               <w:rPr>
                 <w:b w:val="0"/>
               </w:rPr>
-              <w:t>(la 3 y la 4, que se ejecutan en el clon): ese ordenador no tiene web propia. Para ver los pedidos y apuntar lo que fabrica tiene que hablar por la red con la web de la principal, y para encontrarla necesita su dirección: la IP de la principal y el puerto 8000 (http://192.168.1.10:8000).</w:t>
+              <w:t>(la 3 y la 4, que se ejecutan en el clon): ese ordenador no tiene web propia. Para ver los pedidos y apuntar lo que fabrica tiene que hablar por la red con la web de la principal, y para encontrarla necesita su dirección: la IP de la principal y el puerto 8000 (http://IP_DEL_PRINCIPAL:8000).</w:t>
             </w:r>
           </w:p>
           <w:p>

</xml_diff>

<commit_message>
Revision final: plantillas Word con usuarios y almacen por variante, Pico con pantalla en la portada y traducciones al dia
Co-Authored-By: Claude Opus 5.5 <noreply@anthropic.com>
</commit_message>
<xml_diff>
--- a/Documentacion/Plantillas/Configuracion_Taller_EJEMPLO.docx
+++ b/Documentacion/Plantillas/Configuracion_Taller_EJEMPLO.docx
@@ -2614,7 +2614,7 @@
           <w:b w:val="0"/>
           <w:i w:val="0"/>
         </w:rPr>
-        <w:t>La familia de pieza (tornillos, clavos...). Es lo que la cadena fabrica y lo que se guarda en el almacén.</w:t>
+        <w:t>La familia de pieza (tornillos, clavos...). Decide el color de la luz y a qué grupo de cadenas va.</w:t>
       </w:r>
     </w:p>
     <w:p>
@@ -3125,7 +3125,7 @@
           <w:b w:val="0"/>
           <w:i w:val="0"/>
         </w:rPr>
-        <w:t>Los tamaños o variantes de cada producto. Es lo que pide el cliente y lo que lleva precio.</w:t>
+        <w:t>Los tamaños o variantes de cada producto. Es lo que pide el cliente, lo que lleva precio y lo que se guarda en el almacén.</w:t>
       </w:r>
     </w:p>
     <w:p>
@@ -3889,6 +3889,20 @@
       <w:pPr>
         <w:spacing w:after="40"/>
       </w:pPr>
+    </w:p>
+    <w:p>
+      <w:pPr>
+        <w:spacing w:before="0" w:after="80"/>
+      </w:pPr>
+      <w:r>
+        <w:rPr>
+          <w:b w:val="0"/>
+          <w:i/>
+          <w:color w:val="555B66"/>
+          <w:sz w:val="18"/>
+        </w:rPr>
+        <w:t>Cada subproducto es una pieza distinta: tiene su propio almacén y un lote nunca las mezcla (un tornillo de 10 mm nunca sale por uno de 20 mm).</w:t>
+      </w:r>
     </w:p>
     <w:p>
       <w:pPr>
@@ -4369,7 +4383,7 @@
           <w:b w:val="0"/>
           <w:i w:val="0"/>
         </w:rPr>
-        <w:t>Quién entra en la web del taller y qué parte ve: Taller (pedidos y producción) o Administración (clientes, albaranes y facturas). Se pueden marcar las dos.</w:t>
+        <w:t>La gente de nuestro taller que entra en la web. Cada persona es un «Empleado de la empresa» y ve solo lo que se le marque: Producción, Contabilidad o las dos.</w:t>
       </w:r>
     </w:p>
     <w:p>
@@ -4396,8 +4410,516 @@
           <w:color w:val="555B66"/>
           <w:sz w:val="18"/>
         </w:rPr>
-        <w:t>web del taller, usuarios.</w:t>
+        <w:t>web del taller, Administración &gt; Usuarios (rol «Empleado de la empresa» y sus casillas).</w:t>
       </w:r>
+    </w:p>
+    <w:tbl>
+      <w:tblPr>
+        <w:tblStyle w:val="TableGrid"/>
+        <w:tblW w:type="auto" w:w="0"/>
+        <w:jc w:val="center"/>
+        <w:tblLayout w:type="fixed"/>
+        <w:tblLook w:firstColumn="1" w:firstRow="1" w:lastColumn="0" w:lastRow="0" w:noHBand="0" w:noVBand="1" w:val="04A0"/>
+      </w:tblPr>
+      <w:tblGrid>
+        <w:gridCol w:w="1361"/>
+        <w:gridCol w:w="1814"/>
+        <w:gridCol w:w="1474"/>
+        <w:gridCol w:w="1304"/>
+        <w:gridCol w:w="1587"/>
+        <w:gridCol w:w="2324"/>
+      </w:tblGrid>
+      <w:tr>
+        <w:trPr>
+          <w:tblHeader w:val="true"/>
+        </w:trPr>
+        <w:tc>
+          <w:tcPr>
+            <w:tcW w:type="dxa" w:w="1361"/>
+            <w:shd w:val="clear" w:color="auto" w:fill="DCE6F1"/>
+            <w:vAlign w:val="center"/>
+          </w:tcPr>
+          <w:p>
+            <w:r>
+              <w:rPr>
+                <w:b/>
+                <w:color w:val="1F3A5F"/>
+                <w:sz w:val="18"/>
+              </w:rPr>
+              <w:t>Usuario</w:t>
+            </w:r>
+          </w:p>
+        </w:tc>
+        <w:tc>
+          <w:tcPr>
+            <w:tcW w:type="dxa" w:w="1814"/>
+            <w:shd w:val="clear" w:color="auto" w:fill="DCE6F1"/>
+            <w:vAlign w:val="center"/>
+          </w:tcPr>
+          <w:p>
+            <w:r>
+              <w:rPr>
+                <w:b/>
+                <w:color w:val="1F3A5F"/>
+                <w:sz w:val="18"/>
+              </w:rPr>
+              <w:t>Nombre y apellidos</w:t>
+            </w:r>
+          </w:p>
+        </w:tc>
+        <w:tc>
+          <w:tcPr>
+            <w:tcW w:type="dxa" w:w="1474"/>
+            <w:shd w:val="clear" w:color="auto" w:fill="DCE6F1"/>
+            <w:vAlign w:val="center"/>
+          </w:tcPr>
+          <w:p>
+            <w:r>
+              <w:rPr>
+                <w:b/>
+                <w:color w:val="1F3A5F"/>
+                <w:sz w:val="18"/>
+              </w:rPr>
+              <w:t>Rol</w:t>
+            </w:r>
+          </w:p>
+        </w:tc>
+        <w:tc>
+          <w:tcPr>
+            <w:tcW w:type="dxa" w:w="1304"/>
+            <w:shd w:val="clear" w:color="auto" w:fill="DCE6F1"/>
+            <w:vAlign w:val="center"/>
+          </w:tcPr>
+          <w:p>
+            <w:r>
+              <w:rPr>
+                <w:b/>
+                <w:color w:val="1F3A5F"/>
+                <w:sz w:val="18"/>
+              </w:rPr>
+              <w:t>Producción</w:t>
+            </w:r>
+          </w:p>
+        </w:tc>
+        <w:tc>
+          <w:tcPr>
+            <w:tcW w:type="dxa" w:w="1587"/>
+            <w:shd w:val="clear" w:color="auto" w:fill="DCE6F1"/>
+            <w:vAlign w:val="center"/>
+          </w:tcPr>
+          <w:p>
+            <w:r>
+              <w:rPr>
+                <w:b/>
+                <w:color w:val="1F3A5F"/>
+                <w:sz w:val="18"/>
+              </w:rPr>
+              <w:t>Contabilidad</w:t>
+            </w:r>
+          </w:p>
+        </w:tc>
+        <w:tc>
+          <w:tcPr>
+            <w:tcW w:type="dxa" w:w="2324"/>
+            <w:shd w:val="clear" w:color="auto" w:fill="DCE6F1"/>
+            <w:vAlign w:val="center"/>
+          </w:tcPr>
+          <w:p>
+            <w:r>
+              <w:rPr>
+                <w:b/>
+                <w:color w:val="1F3A5F"/>
+                <w:sz w:val="18"/>
+              </w:rPr>
+              <w:t>Notas</w:t>
+            </w:r>
+          </w:p>
+        </w:tc>
+      </w:tr>
+      <w:tr>
+        <w:trPr>
+          <w:cantSplit/>
+        </w:trPr>
+        <w:tc>
+          <w:tcPr>
+            <w:tcW w:type="dxa" w:w="1361"/>
+            <w:vAlign w:val="center"/>
+          </w:tcPr>
+          <w:p>
+            <w:r>
+              <w:rPr>
+                <w:sz w:val="19"/>
+              </w:rPr>
+              <w:t>admin</w:t>
+            </w:r>
+          </w:p>
+        </w:tc>
+        <w:tc>
+          <w:tcPr>
+            <w:tcW w:type="dxa" w:w="1814"/>
+            <w:vAlign w:val="center"/>
+          </w:tcPr>
+          <w:p>
+            <w:r>
+              <w:rPr>
+                <w:sz w:val="19"/>
+              </w:rPr>
+              <w:t>Jesús</w:t>
+            </w:r>
+          </w:p>
+        </w:tc>
+        <w:tc>
+          <w:tcPr>
+            <w:tcW w:type="dxa" w:w="1474"/>
+            <w:vAlign w:val="center"/>
+          </w:tcPr>
+          <w:p>
+            <w:r>
+              <w:rPr>
+                <w:sz w:val="19"/>
+              </w:rPr>
+              <w:t>Admin. sistema</w:t>
+            </w:r>
+          </w:p>
+        </w:tc>
+        <w:tc>
+          <w:tcPr>
+            <w:tcW w:type="dxa" w:w="1304"/>
+            <w:vAlign w:val="center"/>
+          </w:tcPr>
+          <w:p>
+            <w:pPr>
+              <w:jc w:val="center"/>
+            </w:pPr>
+            <w:r>
+              <w:rPr>
+                <w:sz w:val="19"/>
+              </w:rPr>
+              <w:t>—</w:t>
+            </w:r>
+          </w:p>
+        </w:tc>
+        <w:tc>
+          <w:tcPr>
+            <w:tcW w:type="dxa" w:w="1587"/>
+            <w:vAlign w:val="center"/>
+          </w:tcPr>
+          <w:p>
+            <w:pPr>
+              <w:jc w:val="center"/>
+            </w:pPr>
+            <w:r>
+              <w:rPr>
+                <w:sz w:val="19"/>
+              </w:rPr>
+              <w:t>—</w:t>
+            </w:r>
+          </w:p>
+        </w:tc>
+        <w:tc>
+          <w:tcPr>
+            <w:tcW w:type="dxa" w:w="2324"/>
+            <w:vAlign w:val="center"/>
+          </w:tcPr>
+          <w:p>
+            <w:r>
+              <w:rPr>
+                <w:sz w:val="19"/>
+              </w:rPr>
+              <w:t>Lo ve y lo toca todo; el único que ve Administración</w:t>
+            </w:r>
+          </w:p>
+        </w:tc>
+      </w:tr>
+      <w:tr>
+        <w:trPr>
+          <w:cantSplit/>
+        </w:trPr>
+        <w:tc>
+          <w:tcPr>
+            <w:tcW w:type="dxa" w:w="1361"/>
+            <w:vAlign w:val="center"/>
+          </w:tcPr>
+          <w:p>
+            <w:r>
+              <w:rPr>
+                <w:sz w:val="19"/>
+              </w:rPr>
+              <w:t>jefe-taller</w:t>
+            </w:r>
+          </w:p>
+        </w:tc>
+        <w:tc>
+          <w:tcPr>
+            <w:tcW w:type="dxa" w:w="1814"/>
+            <w:vAlign w:val="center"/>
+          </w:tcPr>
+          <w:p>
+            <w:r>
+              <w:rPr>
+                <w:sz w:val="19"/>
+              </w:rPr>
+              <w:t>Ana López</w:t>
+            </w:r>
+          </w:p>
+        </w:tc>
+        <w:tc>
+          <w:tcPr>
+            <w:tcW w:type="dxa" w:w="1474"/>
+            <w:vAlign w:val="center"/>
+          </w:tcPr>
+          <w:p>
+            <w:r>
+              <w:rPr>
+                <w:sz w:val="19"/>
+              </w:rPr>
+              <w:t>Empleado</w:t>
+            </w:r>
+          </w:p>
+        </w:tc>
+        <w:tc>
+          <w:tcPr>
+            <w:tcW w:type="dxa" w:w="1304"/>
+            <w:vAlign w:val="center"/>
+          </w:tcPr>
+          <w:p>
+            <w:pPr>
+              <w:jc w:val="center"/>
+            </w:pPr>
+            <w:r>
+              <w:rPr>
+                <w:sz w:val="19"/>
+              </w:rPr>
+              <w:t>Sí</w:t>
+            </w:r>
+          </w:p>
+        </w:tc>
+        <w:tc>
+          <w:tcPr>
+            <w:tcW w:type="dxa" w:w="1587"/>
+            <w:vAlign w:val="center"/>
+          </w:tcPr>
+          <w:p>
+            <w:pPr>
+              <w:jc w:val="center"/>
+            </w:pPr>
+            <w:r>
+              <w:rPr>
+                <w:sz w:val="19"/>
+              </w:rPr>
+              <w:t>No</w:t>
+            </w:r>
+          </w:p>
+        </w:tc>
+        <w:tc>
+          <w:tcPr>
+            <w:tcW w:type="dxa" w:w="2324"/>
+            <w:vAlign w:val="center"/>
+          </w:tcPr>
+          <w:p>
+            <w:r>
+              <w:rPr>
+                <w:sz w:val="19"/>
+              </w:rPr>
+              <w:t>Pedidos, reparto y almacén</w:t>
+            </w:r>
+          </w:p>
+        </w:tc>
+      </w:tr>
+      <w:tr>
+        <w:trPr>
+          <w:cantSplit/>
+        </w:trPr>
+        <w:tc>
+          <w:tcPr>
+            <w:tcW w:type="dxa" w:w="1361"/>
+            <w:vAlign w:val="center"/>
+          </w:tcPr>
+          <w:p>
+            <w:r>
+              <w:rPr>
+                <w:sz w:val="19"/>
+              </w:rPr>
+              <w:t>operario1</w:t>
+            </w:r>
+          </w:p>
+        </w:tc>
+        <w:tc>
+          <w:tcPr>
+            <w:tcW w:type="dxa" w:w="1814"/>
+            <w:vAlign w:val="center"/>
+          </w:tcPr>
+          <w:p>
+            <w:r>
+              <w:rPr>
+                <w:sz w:val="19"/>
+              </w:rPr>
+              <w:t>Mikel Etxebarria</w:t>
+            </w:r>
+          </w:p>
+        </w:tc>
+        <w:tc>
+          <w:tcPr>
+            <w:tcW w:type="dxa" w:w="1474"/>
+            <w:vAlign w:val="center"/>
+          </w:tcPr>
+          <w:p>
+            <w:r>
+              <w:rPr>
+                <w:sz w:val="19"/>
+              </w:rPr>
+              <w:t>Empleado</w:t>
+            </w:r>
+          </w:p>
+        </w:tc>
+        <w:tc>
+          <w:tcPr>
+            <w:tcW w:type="dxa" w:w="1304"/>
+            <w:vAlign w:val="center"/>
+          </w:tcPr>
+          <w:p>
+            <w:pPr>
+              <w:jc w:val="center"/>
+            </w:pPr>
+            <w:r>
+              <w:rPr>
+                <w:sz w:val="19"/>
+              </w:rPr>
+              <w:t>Sí</w:t>
+            </w:r>
+          </w:p>
+        </w:tc>
+        <w:tc>
+          <w:tcPr>
+            <w:tcW w:type="dxa" w:w="1587"/>
+            <w:vAlign w:val="center"/>
+          </w:tcPr>
+          <w:p>
+            <w:pPr>
+              <w:jc w:val="center"/>
+            </w:pPr>
+            <w:r>
+              <w:rPr>
+                <w:sz w:val="19"/>
+              </w:rPr>
+              <w:t>No</w:t>
+            </w:r>
+          </w:p>
+        </w:tc>
+        <w:tc>
+          <w:tcPr>
+            <w:tcW w:type="dxa" w:w="2324"/>
+            <w:vAlign w:val="center"/>
+          </w:tcPr>
+          <w:p>
+            <w:r>
+              <w:rPr>
+                <w:sz w:val="19"/>
+              </w:rPr>
+            </w:r>
+          </w:p>
+        </w:tc>
+      </w:tr>
+      <w:tr>
+        <w:trPr>
+          <w:cantSplit/>
+        </w:trPr>
+        <w:tc>
+          <w:tcPr>
+            <w:tcW w:type="dxa" w:w="1361"/>
+            <w:vAlign w:val="center"/>
+          </w:tcPr>
+          <w:p>
+            <w:r>
+              <w:rPr>
+                <w:sz w:val="19"/>
+              </w:rPr>
+              <w:t>contable</w:t>
+            </w:r>
+          </w:p>
+        </w:tc>
+        <w:tc>
+          <w:tcPr>
+            <w:tcW w:type="dxa" w:w="1814"/>
+            <w:vAlign w:val="center"/>
+          </w:tcPr>
+          <w:p>
+            <w:r>
+              <w:rPr>
+                <w:sz w:val="19"/>
+              </w:rPr>
+              <w:t>Laura Gómez</w:t>
+            </w:r>
+          </w:p>
+        </w:tc>
+        <w:tc>
+          <w:tcPr>
+            <w:tcW w:type="dxa" w:w="1474"/>
+            <w:vAlign w:val="center"/>
+          </w:tcPr>
+          <w:p>
+            <w:r>
+              <w:rPr>
+                <w:sz w:val="19"/>
+              </w:rPr>
+              <w:t>Empleado</w:t>
+            </w:r>
+          </w:p>
+        </w:tc>
+        <w:tc>
+          <w:tcPr>
+            <w:tcW w:type="dxa" w:w="1304"/>
+            <w:vAlign w:val="center"/>
+          </w:tcPr>
+          <w:p>
+            <w:pPr>
+              <w:jc w:val="center"/>
+            </w:pPr>
+            <w:r>
+              <w:rPr>
+                <w:sz w:val="19"/>
+              </w:rPr>
+              <w:t>No</w:t>
+            </w:r>
+          </w:p>
+        </w:tc>
+        <w:tc>
+          <w:tcPr>
+            <w:tcW w:type="dxa" w:w="1587"/>
+            <w:vAlign w:val="center"/>
+          </w:tcPr>
+          <w:p>
+            <w:pPr>
+              <w:jc w:val="center"/>
+            </w:pPr>
+            <w:r>
+              <w:rPr>
+                <w:sz w:val="19"/>
+              </w:rPr>
+              <w:t>Sí</w:t>
+            </w:r>
+          </w:p>
+        </w:tc>
+        <w:tc>
+          <w:tcPr>
+            <w:tcW w:type="dxa" w:w="2324"/>
+            <w:vAlign w:val="center"/>
+          </w:tcPr>
+          <w:p>
+            <w:r>
+              <w:rPr>
+                <w:sz w:val="19"/>
+              </w:rPr>
+              <w:t>Tarifas y facturas</w:t>
+            </w:r>
+          </w:p>
+        </w:tc>
+      </w:tr>
+    </w:tbl>
+    <w:p>
+      <w:pPr>
+        <w:spacing w:after="40"/>
+      </w:pPr>
     </w:p>
     <w:tbl>
       <w:tblPr>
@@ -4416,7 +4938,7 @@
         <w:tc>
           <w:tcPr>
             <w:tcW w:type="dxa" w:w="9865"/>
-            <w:shd w:val="clear" w:color="auto" w:fill="FFF4D6"/>
+            <w:shd w:val="clear" w:color="auto" w:fill="EEF3F8"/>
           </w:tcPr>
           <w:p>
             <w:r>
@@ -4424,7 +4946,7 @@
                 <w:b/>
                 <w:color w:val="1F3A5F"/>
               </w:rPr>
-              <w:t>En preparación</w:t>
+              <w:t>Qué ve cada uno</w:t>
             </w:r>
           </w:p>
           <w:p>
@@ -4434,443 +4956,69 @@
             </w:pPr>
             <w:r>
               <w:rPr>
+                <w:b/>
+              </w:rPr>
+              <w:t xml:space="preserve">Producción: </w:t>
+            </w:r>
+            <w:r>
+              <w:rPr>
                 <w:b w:val="0"/>
               </w:rPr>
-              <w:t>El reparto «unos ven solo Taller y otros solo Administración» todavía se está haciendo. De momento este apartado sirve para dejar apuntado quién tiene que ver qué.</w:t>
+              <w:t>Pedidos Taller, Reparto, Almacén y Diagnóstico.</w:t>
             </w:r>
           </w:p>
-        </w:tc>
-      </w:tr>
-    </w:tbl>
-    <w:p>
-      <w:pPr>
-        <w:spacing w:after="40"/>
-      </w:pPr>
-    </w:p>
-    <w:tbl>
-      <w:tblPr>
-        <w:tblStyle w:val="TableGrid"/>
-        <w:tblW w:type="auto" w:w="0"/>
-        <w:jc w:val="center"/>
-        <w:tblLayout w:type="fixed"/>
-        <w:tblLook w:firstColumn="1" w:firstRow="1" w:lastColumn="0" w:lastRow="0" w:noHBand="0" w:noVBand="1" w:val="04A0"/>
-      </w:tblPr>
-      <w:tblGrid>
-        <w:gridCol w:w="1701"/>
-        <w:gridCol w:w="2494"/>
-        <w:gridCol w:w="1020"/>
-        <w:gridCol w:w="1928"/>
-        <w:gridCol w:w="2721"/>
-      </w:tblGrid>
-      <w:tr>
-        <w:trPr>
-          <w:tblHeader w:val="true"/>
-        </w:trPr>
-        <w:tc>
-          <w:tcPr>
-            <w:tcW w:type="dxa" w:w="1701"/>
-            <w:shd w:val="clear" w:color="auto" w:fill="DCE6F1"/>
-            <w:vAlign w:val="center"/>
-          </w:tcPr>
-          <w:p>
-            <w:r>
-              <w:rPr>
-                <w:b/>
-                <w:color w:val="1F3A5F"/>
-                <w:sz w:val="18"/>
-              </w:rPr>
-              <w:t>Usuario</w:t>
-            </w:r>
-          </w:p>
-        </w:tc>
-        <w:tc>
-          <w:tcPr>
-            <w:tcW w:type="dxa" w:w="2494"/>
-            <w:shd w:val="clear" w:color="auto" w:fill="DCE6F1"/>
-            <w:vAlign w:val="center"/>
-          </w:tcPr>
-          <w:p>
-            <w:r>
-              <w:rPr>
-                <w:b/>
-                <w:color w:val="1F3A5F"/>
-                <w:sz w:val="18"/>
-              </w:rPr>
-              <w:t>Nombre y apellidos</w:t>
-            </w:r>
-          </w:p>
-        </w:tc>
-        <w:tc>
-          <w:tcPr>
-            <w:tcW w:type="dxa" w:w="1020"/>
-            <w:shd w:val="clear" w:color="auto" w:fill="DCE6F1"/>
-            <w:vAlign w:val="center"/>
-          </w:tcPr>
-          <w:p>
-            <w:r>
-              <w:rPr>
-                <w:b/>
-                <w:color w:val="1F3A5F"/>
-                <w:sz w:val="18"/>
-              </w:rPr>
-              <w:t>Taller</w:t>
-            </w:r>
-          </w:p>
-        </w:tc>
-        <w:tc>
-          <w:tcPr>
-            <w:tcW w:type="dxa" w:w="1928"/>
-            <w:shd w:val="clear" w:color="auto" w:fill="DCE6F1"/>
-            <w:vAlign w:val="center"/>
-          </w:tcPr>
-          <w:p>
-            <w:r>
-              <w:rPr>
-                <w:b/>
-                <w:color w:val="1F3A5F"/>
-                <w:sz w:val="18"/>
-              </w:rPr>
-              <w:t>Administración</w:t>
-            </w:r>
-          </w:p>
-        </w:tc>
-        <w:tc>
-          <w:tcPr>
-            <w:tcW w:type="dxa" w:w="2721"/>
-            <w:shd w:val="clear" w:color="auto" w:fill="DCE6F1"/>
-            <w:vAlign w:val="center"/>
-          </w:tcPr>
-          <w:p>
-            <w:r>
-              <w:rPr>
-                <w:b/>
-                <w:color w:val="1F3A5F"/>
-                <w:sz w:val="18"/>
-              </w:rPr>
-              <w:t>Notas</w:t>
-            </w:r>
-          </w:p>
-        </w:tc>
-      </w:tr>
-      <w:tr>
-        <w:trPr>
-          <w:cantSplit/>
-        </w:trPr>
-        <w:tc>
-          <w:tcPr>
-            <w:tcW w:type="dxa" w:w="1701"/>
-            <w:vAlign w:val="center"/>
-          </w:tcPr>
-          <w:p>
-            <w:r>
-              <w:rPr>
-                <w:sz w:val="19"/>
-              </w:rPr>
-              <w:t>jefe-taller</w:t>
-            </w:r>
-          </w:p>
-        </w:tc>
-        <w:tc>
-          <w:tcPr>
-            <w:tcW w:type="dxa" w:w="2494"/>
-            <w:vAlign w:val="center"/>
-          </w:tcPr>
-          <w:p>
-            <w:r>
-              <w:rPr>
-                <w:sz w:val="19"/>
-              </w:rPr>
-              <w:t>Ana López</w:t>
-            </w:r>
-          </w:p>
-        </w:tc>
-        <w:tc>
-          <w:tcPr>
-            <w:tcW w:type="dxa" w:w="1020"/>
-            <w:vAlign w:val="center"/>
-          </w:tcPr>
           <w:p>
             <w:pPr>
-              <w:jc w:val="center"/>
+              <w:pStyle w:val="ListBullet"/>
+              <w:spacing w:after="20"/>
             </w:pPr>
             <w:r>
               <w:rPr>
-                <w:sz w:val="19"/>
-              </w:rPr>
-              <w:t>Sí</w:t>
+                <w:b/>
+              </w:rPr>
+              <w:t xml:space="preserve">Contabilidad: </w:t>
+            </w:r>
+            <w:r>
+              <w:rPr>
+                <w:b w:val="0"/>
+              </w:rPr>
+              <w:t>Resumen, Tarifas y Facturación.</w:t>
             </w:r>
           </w:p>
-        </w:tc>
-        <w:tc>
-          <w:tcPr>
-            <w:tcW w:type="dxa" w:w="1928"/>
-            <w:vAlign w:val="center"/>
-          </w:tcPr>
           <w:p>
             <w:pPr>
-              <w:jc w:val="center"/>
+              <w:pStyle w:val="ListBullet"/>
+              <w:spacing w:after="20"/>
             </w:pPr>
             <w:r>
               <w:rPr>
-                <w:sz w:val="19"/>
-              </w:rPr>
-              <w:t>No</w:t>
+                <w:b/>
+              </w:rPr>
+              <w:t xml:space="preserve">Administración </w:t>
+            </w:r>
+            <w:r>
+              <w:rPr>
+                <w:b w:val="0"/>
+              </w:rPr>
+              <w:t>(empresas, productos, usuarios, clientes...) es solo del «Admin. sistema»: a un empleado nunca se le puede dar.</w:t>
             </w:r>
           </w:p>
-        </w:tc>
-        <w:tc>
-          <w:tcPr>
-            <w:tcW w:type="dxa" w:w="2721"/>
-            <w:vAlign w:val="center"/>
-          </w:tcPr>
-          <w:p>
-            <w:r>
-              <w:rPr>
-                <w:sz w:val="19"/>
-              </w:rPr>
-              <w:t>Ve pedidos y producción</w:t>
-            </w:r>
-          </w:p>
-        </w:tc>
-      </w:tr>
-      <w:tr>
-        <w:trPr>
-          <w:cantSplit/>
-        </w:trPr>
-        <w:tc>
-          <w:tcPr>
-            <w:tcW w:type="dxa" w:w="1701"/>
-            <w:vAlign w:val="center"/>
-          </w:tcPr>
-          <w:p>
-            <w:r>
-              <w:rPr>
-                <w:sz w:val="19"/>
-              </w:rPr>
-              <w:t>operario1</w:t>
-            </w:r>
-          </w:p>
-        </w:tc>
-        <w:tc>
-          <w:tcPr>
-            <w:tcW w:type="dxa" w:w="2494"/>
-            <w:vAlign w:val="center"/>
-          </w:tcPr>
-          <w:p>
-            <w:r>
-              <w:rPr>
-                <w:sz w:val="19"/>
-              </w:rPr>
-              <w:t>Mikel Etxebarria</w:t>
-            </w:r>
-          </w:p>
-        </w:tc>
-        <w:tc>
-          <w:tcPr>
-            <w:tcW w:type="dxa" w:w="1020"/>
-            <w:vAlign w:val="center"/>
-          </w:tcPr>
           <w:p>
             <w:pPr>
-              <w:jc w:val="center"/>
+              <w:pStyle w:val="ListBullet"/>
+              <w:spacing w:after="20"/>
             </w:pPr>
             <w:r>
               <w:rPr>
-                <w:sz w:val="19"/>
-              </w:rPr>
-              <w:t>Sí</w:t>
-            </w:r>
-          </w:p>
-        </w:tc>
-        <w:tc>
-          <w:tcPr>
-            <w:tcW w:type="dxa" w:w="1928"/>
-            <w:vAlign w:val="center"/>
-          </w:tcPr>
-          <w:p>
-            <w:pPr>
-              <w:jc w:val="center"/>
-            </w:pPr>
-            <w:r>
-              <w:rPr>
-                <w:sz w:val="19"/>
-              </w:rPr>
-              <w:t>No</w:t>
-            </w:r>
-          </w:p>
-        </w:tc>
-        <w:tc>
-          <w:tcPr>
-            <w:tcW w:type="dxa" w:w="2721"/>
-            <w:vAlign w:val="center"/>
-          </w:tcPr>
-          <w:p>
-            <w:r>
-              <w:rPr>
-                <w:sz w:val="19"/>
-              </w:rPr>
-            </w:r>
-          </w:p>
-        </w:tc>
-      </w:tr>
-      <w:tr>
-        <w:trPr>
-          <w:cantSplit/>
-        </w:trPr>
-        <w:tc>
-          <w:tcPr>
-            <w:tcW w:type="dxa" w:w="1701"/>
-            <w:vAlign w:val="center"/>
-          </w:tcPr>
-          <w:p>
-            <w:r>
-              <w:rPr>
-                <w:sz w:val="19"/>
-              </w:rPr>
-              <w:t>administracion</w:t>
-            </w:r>
-          </w:p>
-        </w:tc>
-        <w:tc>
-          <w:tcPr>
-            <w:tcW w:type="dxa" w:w="2494"/>
-            <w:vAlign w:val="center"/>
-          </w:tcPr>
-          <w:p>
-            <w:r>
-              <w:rPr>
-                <w:sz w:val="19"/>
-              </w:rPr>
-              <w:t>Laura Gómez</w:t>
-            </w:r>
-          </w:p>
-        </w:tc>
-        <w:tc>
-          <w:tcPr>
-            <w:tcW w:type="dxa" w:w="1020"/>
-            <w:vAlign w:val="center"/>
-          </w:tcPr>
-          <w:p>
-            <w:pPr>
-              <w:jc w:val="center"/>
-            </w:pPr>
-            <w:r>
-              <w:rPr>
-                <w:sz w:val="19"/>
-              </w:rPr>
-              <w:t>No</w:t>
-            </w:r>
-          </w:p>
-        </w:tc>
-        <w:tc>
-          <w:tcPr>
-            <w:tcW w:type="dxa" w:w="1928"/>
-            <w:vAlign w:val="center"/>
-          </w:tcPr>
-          <w:p>
-            <w:pPr>
-              <w:jc w:val="center"/>
-            </w:pPr>
-            <w:r>
-              <w:rPr>
-                <w:sz w:val="19"/>
-              </w:rPr>
-              <w:t>Sí</w:t>
-            </w:r>
-          </w:p>
-        </w:tc>
-        <w:tc>
-          <w:tcPr>
-            <w:tcW w:type="dxa" w:w="2721"/>
-            <w:vAlign w:val="center"/>
-          </w:tcPr>
-          <w:p>
-            <w:r>
-              <w:rPr>
-                <w:sz w:val="19"/>
-              </w:rPr>
-              <w:t>Albaranes, facturas y clientes</w:t>
-            </w:r>
-          </w:p>
-        </w:tc>
-      </w:tr>
-      <w:tr>
-        <w:trPr>
-          <w:cantSplit/>
-        </w:trPr>
-        <w:tc>
-          <w:tcPr>
-            <w:tcW w:type="dxa" w:w="1701"/>
-            <w:vAlign w:val="center"/>
-          </w:tcPr>
-          <w:p>
-            <w:r>
-              <w:rPr>
-                <w:sz w:val="19"/>
-              </w:rPr>
-              <w:t>gerente</w:t>
-            </w:r>
-          </w:p>
-        </w:tc>
-        <w:tc>
-          <w:tcPr>
-            <w:tcW w:type="dxa" w:w="2494"/>
-            <w:vAlign w:val="center"/>
-          </w:tcPr>
-          <w:p>
-            <w:r>
-              <w:rPr>
-                <w:sz w:val="19"/>
-              </w:rPr>
-              <w:t>Jesús</w:t>
-            </w:r>
-          </w:p>
-        </w:tc>
-        <w:tc>
-          <w:tcPr>
-            <w:tcW w:type="dxa" w:w="1020"/>
-            <w:vAlign w:val="center"/>
-          </w:tcPr>
-          <w:p>
-            <w:pPr>
-              <w:jc w:val="center"/>
-            </w:pPr>
-            <w:r>
-              <w:rPr>
-                <w:sz w:val="19"/>
-              </w:rPr>
-              <w:t>Sí</w:t>
-            </w:r>
-          </w:p>
-        </w:tc>
-        <w:tc>
-          <w:tcPr>
-            <w:tcW w:type="dxa" w:w="1928"/>
-            <w:vAlign w:val="center"/>
-          </w:tcPr>
-          <w:p>
-            <w:pPr>
-              <w:jc w:val="center"/>
-            </w:pPr>
-            <w:r>
-              <w:rPr>
-                <w:sz w:val="19"/>
-              </w:rPr>
-              <w:t>Sí</w:t>
-            </w:r>
-          </w:p>
-        </w:tc>
-        <w:tc>
-          <w:tcPr>
-            <w:tcW w:type="dxa" w:w="2721"/>
-            <w:vAlign w:val="center"/>
-          </w:tcPr>
-          <w:p>
-            <w:r>
-              <w:rPr>
-                <w:sz w:val="19"/>
-              </w:rPr>
-              <w:t>Ve todo</w:t>
+                <w:b/>
+              </w:rPr>
+              <w:t xml:space="preserve">La gente de los clientes no va aquí: </w:t>
+            </w:r>
+            <w:r>
+              <w:rPr>
+                <w:b w:val="0"/>
+              </w:rPr>
+              <w:t>sus usuarios («Normal» y «Admin. cliente») se crean con cada cliente y solo ven sus propios pedidos.</w:t>
             </w:r>
           </w:p>
         </w:tc>
@@ -6244,6 +6392,40 @@
           <w:b w:val="0"/>
         </w:rPr>
         <w:t>Cada cadena de otro ordenador tiene puesta la URL de la web del principal en su panel y ve los pedidos.</w:t>
+      </w:r>
+    </w:p>
+    <w:p>
+      <w:pPr>
+        <w:spacing w:after="40"/>
+      </w:pPr>
+      <w:r>
+        <w:rPr>
+          <w:b w:val="0"/>
+        </w:rPr>
+        <w:t xml:space="preserve">☐  </w:t>
+      </w:r>
+      <w:r>
+        <w:rPr>
+          <w:b w:val="0"/>
+        </w:rPr>
+        <w:t>Cada empleado tiene marcada al menos una casilla (Producción o Contabilidad); si no, entra y no ve nada.</w:t>
+      </w:r>
+    </w:p>
+    <w:p>
+      <w:pPr>
+        <w:spacing w:after="40"/>
+      </w:pPr>
+      <w:r>
+        <w:rPr>
+          <w:b w:val="0"/>
+        </w:rPr>
+        <w:t xml:space="preserve">☐  </w:t>
+      </w:r>
+      <w:r>
+        <w:rPr>
+          <w:b w:val="0"/>
+        </w:rPr>
+        <w:t>La contraseña de fábrica de «admin» está cambiada.</w:t>
       </w:r>
     </w:p>
     <w:sectPr>

</xml_diff>